<commit_message>
fix: map late Year 1 Arabic lessons
</commit_message>
<xml_diff>
--- a/curriculum/rpt/RPT_Bahasa_Arab_Tahun1_2026_KumpulanB_SourceFirst.docx
+++ b/curriculum/rpt/RPT_Bahasa_Arab_Tahun1_2026_KumpulanB_SourceFirst.docx
@@ -8280,7 +8280,15 @@
           <w:sz w:val="24"/>
           <w:rtl w:val="0"/>
         </w:rPr>
-        <w:t>Penggal 2B</w:t>
+        <w:t xml:space="preserve">Penggal </w:t>
+      </w:r>
+      <w:r>
+        <w:rPr>
+          <w:rFonts w:ascii="Arial" w:hAnsi="Arial"/>
+          <w:b/>
+          <w:sz w:val="24"/>
+        </w:rPr>
+        <w:t>2B</w:t>
       </w:r>
     </w:p>
     <w:tbl>
@@ -10514,9 +10522,7 @@
                 <w:sz w:val="14"/>
                 <w:rtl/>
               </w:rPr>
-              <w:t>Unit 4: نمرح بالأرقام</w:t>
-              <w:br/>
-              <w:t>Menyalin nombor 1-10</w:t>
+              <w:t>Unit 4: نمرح بالأرقام - Menyalin nombor 1-10</w:t>
             </w:r>
           </w:p>
         </w:tc>
@@ -10600,7 +10606,7 @@
                 <w:color w:val="000000"/>
                 <w:sz w:val="14"/>
               </w:rPr>
-              <w:t>Salin angka dan perkataan nombor 1-10; semak ketepatan hasil.</w:t>
+              <w:t>Baca angka dan perkataan nombor 1-10 pada m/s 49; salin bentuk yang betul dan semak ketepatan hasil.</w:t>
             </w:r>
           </w:p>
         </w:tc>
@@ -10628,7 +10634,7 @@
                 <w:color w:val="000000"/>
                 <w:sz w:val="14"/>
               </w:rPr>
-              <w:t>47-50</w:t>
+              <w:t>49</w:t>
             </w:r>
           </w:p>
         </w:tc>
@@ -10656,6 +10662,7 @@
                 <w:color w:val="000000"/>
                 <w:sz w:val="14"/>
               </w:rPr>
+              <w:t>Sumber tepat: BT m/s 49</w:t>
             </w:r>
           </w:p>
         </w:tc>
@@ -10747,9 +10754,7 @@
                 <w:color w:val="000000"/>
                 <w:sz w:val="14"/>
               </w:rPr>
-              <w:t>Pengayaan</w:t>
-              <w:br/>
-              <w:t>Minggu Bahasa Arab 1</w:t>
+              <w:t>Unit 4: نمرح بالأرقام - Pengayaan nombor 1-5</w:t>
             </w:r>
           </w:p>
         </w:tc>
@@ -10778,7 +10783,7 @@
                 <w:color w:val="000000"/>
                 <w:sz w:val="14"/>
               </w:rPr>
-              <w:t>Ulang kaji</w:t>
+              <w:t>1.5</w:t>
             </w:r>
           </w:p>
         </w:tc>
@@ -10807,7 +10812,7 @@
                 <w:color w:val="000000"/>
                 <w:sz w:val="14"/>
               </w:rPr>
-              <w:t>SP terpilih Unit 1-4</w:t>
+              <w:t>1.5.1-1.5.4</w:t>
             </w:r>
           </w:p>
         </w:tc>
@@ -10836,7 +10841,7 @@
                 <w:color w:val="000000"/>
                 <w:sz w:val="14"/>
               </w:rPr>
-              <w:t>Persembahan bahasa: sebutan, soal-jawab dan permainan kata berasaskan sumber.</w:t>
+              <w:t>Dengar dan ulang sebut nombor 1-5 pada m/s 47; susun nombor secara menaik atau menurun secara lisan.</w:t>
             </w:r>
           </w:p>
         </w:tc>
@@ -10865,7 +10870,7 @@
                 <w:color w:val="000000"/>
                 <w:sz w:val="14"/>
               </w:rPr>
-              <w:t>1-50</w:t>
+              <w:t>47</w:t>
             </w:r>
           </w:p>
         </w:tc>
@@ -10983,9 +10988,7 @@
                 <w:color w:val="000000"/>
                 <w:sz w:val="14"/>
               </w:rPr>
-              <w:t>Pengayaan</w:t>
-              <w:br/>
-              <w:t>Minggu Bahasa Arab 2</w:t>
+              <w:t>Unit 4: نمرح بالأرقام - Pengayaan nombor 6-10</w:t>
             </w:r>
           </w:p>
         </w:tc>
@@ -11013,7 +11016,7 @@
                 <w:color w:val="000000"/>
                 <w:sz w:val="14"/>
               </w:rPr>
-              <w:t>Ulang kaji</w:t>
+              <w:t>1.5</w:t>
             </w:r>
           </w:p>
         </w:tc>
@@ -11041,7 +11044,7 @@
                 <w:color w:val="000000"/>
                 <w:sz w:val="14"/>
               </w:rPr>
-              <w:t>SP terpilih Unit 1-4</w:t>
+              <w:t>1.5.1-1.5.4</w:t>
             </w:r>
           </w:p>
         </w:tc>
@@ -11069,7 +11072,7 @@
                 <w:color w:val="000000"/>
                 <w:sz w:val="14"/>
               </w:rPr>
-              <w:t>Persembahan berkumpulan, bacaan ringkas dan permainan nombor/huruf.</w:t>
+              <w:t>Dengar dan ulang sebut nombor 6-10 pada m/s 48; susun nombor secara menaik atau menurun secara lisan.</w:t>
             </w:r>
           </w:p>
         </w:tc>
@@ -11097,7 +11100,7 @@
                 <w:color w:val="000000"/>
                 <w:sz w:val="14"/>
               </w:rPr>
-              <w:t>1-50</w:t>
+              <w:t>48</w:t>
             </w:r>
           </w:p>
         </w:tc>
@@ -11125,6 +11128,7 @@
                 <w:color w:val="000000"/>
                 <w:sz w:val="14"/>
               </w:rPr>
+              <w:t>Sumber tepat: BT m/s 48</w:t>
             </w:r>
           </w:p>
         </w:tc>
@@ -11216,9 +11220,7 @@
                 <w:color w:val="000000"/>
                 <w:sz w:val="14"/>
               </w:rPr>
-              <w:t>Pengayaan</w:t>
-              <w:br/>
-              <w:t>Projek bahasa</w:t>
+              <w:t>Unit 4: نمرح بالأرقام - Membaca dan menulis nombor</w:t>
             </w:r>
           </w:p>
         </w:tc>
@@ -11247,7 +11249,7 @@
                 <w:color w:val="000000"/>
                 <w:sz w:val="14"/>
               </w:rPr>
-              <w:t>Ulang kaji</w:t>
+              <w:t>2.5, 3.4</w:t>
             </w:r>
           </w:p>
         </w:tc>
@@ -11276,7 +11278,7 @@
                 <w:color w:val="000000"/>
                 <w:sz w:val="14"/>
               </w:rPr>
-              <w:t>SP terpilih Unit 1-4</w:t>
+              <w:t>2.5.1-2.5.4; 3.4.1</w:t>
             </w:r>
           </w:p>
         </w:tc>
@@ -11305,7 +11307,7 @@
                 <w:color w:val="000000"/>
                 <w:sz w:val="14"/>
               </w:rPr>
-              <w:t>Sediakan buku skrap atau kad imbas daripada huruf, ucapan atau nombor.</w:t>
+              <w:t>Baca, cam dan padankan angka dengan perkataan nombor pada m/s 49; tulis jawapan mengikut bentuk yang ditunjukkan.</w:t>
             </w:r>
           </w:p>
         </w:tc>
@@ -11334,7 +11336,7 @@
                 <w:color w:val="000000"/>
                 <w:sz w:val="14"/>
               </w:rPr>
-              <w:t>1-50</w:t>
+              <w:t>49</w:t>
             </w:r>
           </w:p>
         </w:tc>
@@ -11363,6 +11365,7 @@
                 <w:color w:val="000000"/>
                 <w:sz w:val="14"/>
               </w:rPr>
+              <w:t>Sumber tepat: BT m/s 49</w:t>
             </w:r>
           </w:p>
         </w:tc>
@@ -11451,9 +11454,7 @@
                 <w:color w:val="000000"/>
                 <w:sz w:val="14"/>
               </w:rPr>
-              <w:t>Pengayaan</w:t>
-              <w:br/>
-              <w:t>Pameran dan refleksi</w:t>
+              <w:t>Unit 4: نمرح بالأرقام - Permainan ulang kaji</w:t>
             </w:r>
           </w:p>
         </w:tc>
@@ -11481,7 +11482,7 @@
                 <w:color w:val="000000"/>
                 <w:sz w:val="14"/>
               </w:rPr>
-              <w:t>Ulang kaji</w:t>
+              <w:t>1.5, 2.5</w:t>
             </w:r>
           </w:p>
         </w:tc>
@@ -11509,7 +11510,7 @@
                 <w:color w:val="000000"/>
                 <w:sz w:val="14"/>
               </w:rPr>
-              <w:t>SP terpilih Unit 1-4</w:t>
+              <w:t>1.5.4; 2.5.4</w:t>
             </w:r>
           </w:p>
         </w:tc>
@@ -11537,7 +11538,7 @@
                 <w:color w:val="000000"/>
                 <w:sz w:val="14"/>
               </w:rPr>
-              <w:t>Siapkan poster/pameran; bentang hasil dan buat refleksi pembelajaran.</w:t>
+              <w:t>Laksanakan permainan lompat petak nombor pada m/s 50; sebut dan pilih nombor 1-10 dengan betul.</w:t>
             </w:r>
           </w:p>
         </w:tc>
@@ -11565,7 +11566,7 @@
                 <w:color w:val="000000"/>
                 <w:sz w:val="14"/>
               </w:rPr>
-              <w:t>1-50</w:t>
+              <w:t>50</w:t>
             </w:r>
           </w:p>
         </w:tc>
@@ -11593,6 +11594,7 @@
                 <w:color w:val="000000"/>
                 <w:sz w:val="14"/>
               </w:rPr>
+              <w:t>Sumber tepat: BT m/s 50</w:t>
             </w:r>
           </w:p>
         </w:tc>
@@ -11820,6 +11822,87 @@
           <w:sz w:val="17"/>
         </w:rPr>
         <w:t>RPT Bahasa Arab Tahun 1 KSSR Semakan 2022/2023 (urutan kandungan sahaja; tarikh tidak diguna semula).</w:t>
+      </w:r>
+    </w:p>
+    <w:p>
+      <w:r>
+        <w:br w:type="page"/>
+      </w:r>
+    </w:p>
+    <w:p>
+      <w:pPr>
+        <w:pStyle w:val="Heading1"/>
+      </w:pPr>
+      <w:r>
+        <w:t>Pemetaan sesi tepat Minggu 39-43</w:t>
+      </w:r>
+    </w:p>
+    <w:p>
+      <w:pPr>
+        <w:spacing w:after="160"/>
+      </w:pPr>
+      <w:r>
+        <w:t>Pemetaan ini mengunci satu sesi bagi setiap minggu kepada satu SP utama, satu halaman bercetak Buku Teks dan satu tugasan sumber. Lesson Map kekal memerlukan semakan guru sebelum disahkan.</w:t>
+      </w:r>
+    </w:p>
+    <w:p>
+      <w:pPr>
+        <w:spacing w:after="80" w:line="240" w:lineRule="auto"/>
+      </w:pPr>
+      <w:r>
+        <w:rPr>
+          <w:rFonts w:ascii="Arial" w:hAnsi="Arial"/>
+          <w:sz w:val="16"/>
+        </w:rPr>
+        <w:t>Mapping_ID: BA1-2026B-W39-S1 | Generate_Flag: REVIEW | Module: Unit 4: Menyalin nombor 1-10 | Learning_Standard: 3.4.1 | BT_Printed_Page: 49 | Mapping_Method: RPT + halaman bercetak Buku Teks | Mapping_Confidence: 95 | Mapping_Status: SOURCE_GROUNDED_NEEDS_TEACHER_REVIEW | Source_Task: Baca angka dan perkataan nombor 1-10, kemudian salin bentuk yang betul berdasarkan latihan pada BT m/s 49.</w:t>
+      </w:r>
+    </w:p>
+    <w:p>
+      <w:pPr>
+        <w:spacing w:after="80" w:line="240" w:lineRule="auto"/>
+      </w:pPr>
+      <w:r>
+        <w:rPr>
+          <w:rFonts w:ascii="Arial" w:hAnsi="Arial"/>
+          <w:sz w:val="16"/>
+        </w:rPr>
+        <w:t>Mapping_ID: BA1-2026B-W40-S1 | Generate_Flag: REVIEW | Module: Unit 4: Pengayaan nombor 1-5 | Learning_Standard: 1.5.1 | BT_Printed_Page: 47 | Mapping_Method: RPT + halaman bercetak Buku Teks | Mapping_Confidence: 95 | Mapping_Status: SOURCE_GROUNDED_NEEDS_TEACHER_REVIEW | Source_Task: Dengar, ulang sebut dan susun nombor 1-5 berdasarkan aktiviti pada BT m/s 47.</w:t>
+      </w:r>
+    </w:p>
+    <w:p>
+      <w:pPr>
+        <w:spacing w:after="80" w:line="240" w:lineRule="auto"/>
+      </w:pPr>
+      <w:r>
+        <w:rPr>
+          <w:rFonts w:ascii="Arial" w:hAnsi="Arial"/>
+          <w:sz w:val="16"/>
+        </w:rPr>
+        <w:t>Mapping_ID: BA1-2026B-W41-S1 | Generate_Flag: REVIEW | Module: Unit 4: Pengayaan nombor 6-10 | Learning_Standard: 1.5.2 | BT_Printed_Page: 48 | Mapping_Method: RPT + halaman bercetak Buku Teks | Mapping_Confidence: 95 | Mapping_Status: SOURCE_GROUNDED_NEEDS_TEACHER_REVIEW | Source_Task: Dengar, ulang sebut dan susun nombor 6-10 berdasarkan aktiviti pada BT m/s 48.</w:t>
+      </w:r>
+    </w:p>
+    <w:p>
+      <w:pPr>
+        <w:spacing w:after="80" w:line="240" w:lineRule="auto"/>
+      </w:pPr>
+      <w:r>
+        <w:rPr>
+          <w:rFonts w:ascii="Arial" w:hAnsi="Arial"/>
+          <w:sz w:val="16"/>
+        </w:rPr>
+        <w:t>Mapping_ID: BA1-2026B-W42-S1 | Generate_Flag: REVIEW | Module: Unit 4: Membaca dan menulis nombor | Learning_Standard: 2.5.4 | BT_Printed_Page: 49 | Mapping_Method: RPT + halaman bercetak Buku Teks | Mapping_Confidence: 95 | Mapping_Status: SOURCE_GROUNDED_NEEDS_TEACHER_REVIEW | Source_Task: Baca, cam dan padankan angka dengan perkataan nombor, kemudian tulis jawapan berdasarkan BT m/s 49.</w:t>
+      </w:r>
+    </w:p>
+    <w:p>
+      <w:pPr>
+        <w:spacing w:after="80" w:line="240" w:lineRule="auto"/>
+      </w:pPr>
+      <w:r>
+        <w:rPr>
+          <w:rFonts w:ascii="Arial" w:hAnsi="Arial"/>
+          <w:sz w:val="16"/>
+        </w:rPr>
+        <w:t>Mapping_ID: BA1-2026B-W43-S1 | Generate_Flag: REVIEW | Module: Unit 4: Permainan ulang kaji nombor | Learning_Standard: 2.5.4 | BT_Printed_Page: 50 | Mapping_Method: RPT + halaman bercetak Buku Teks | Mapping_Confidence: 95 | Mapping_Status: SOURCE_GROUNDED_NEEDS_TEACHER_REVIEW | Source_Task: Laksanakan permainan lompat petak; sebut dan pilih nombor 1-10 berdasarkan BT m/s 50.</w:t>
       </w:r>
     </w:p>
     <w:sectPr>

</xml_diff>